<commit_message>
Autoevaluación 1.3: todos los indicadores en Completamente Logrado
Co-Authored-By: Claude Opus 5.5 <noreply@anthropic.com>
Claude-Session: https://claude.ai/code/session_01MMdBvcJmnUJ2z1G62Bpdde
</commit_message>
<xml_diff>
--- a/Fase 1/Evidencias Grupales/1.3_APT122_AutoevaluacionFase1.docx
+++ b/Fase 1/Evidencias Grupales/1.3_APT122_AutoevaluacionFase1.docx
@@ -6488,6 +6488,7 @@
           <w:tcPr>
             <w:tcW w:w="2268" w:type="dxa"/>
             <w:tcMar/>
+            <w:shd w:val="clear" w:color="auto" w:fill="C6E0B4"/>
           </w:tcPr>
           <w:p>
             <w:pPr>
@@ -6501,6 +6502,7 @@
             <w:r>
               <w:rPr>
                 <w:rFonts w:asciiTheme="minorHAnsi" w:hAnsiTheme="minorHAnsi" w:eastAsiaTheme="minorEastAsia" w:cstheme="minorBidi"/>
+                <w:b/>
                 <w:color w:val="000000" w:themeColor="text1"/>
               </w:rPr>
               <w:t xml:space="preserve">Describí </w:t>
@@ -6508,6 +6510,7 @@
             <w:r>
               <w:rPr>
                 <w:rFonts w:asciiTheme="minorHAnsi" w:hAnsiTheme="minorHAnsi" w:eastAsiaTheme="minorEastAsia" w:cstheme="minorBidi"/>
+                <w:b/>
                 <w:color w:val="000000" w:themeColor="text1"/>
               </w:rPr>
               <w:t xml:space="preserve">una relación coherente entre </w:t>
@@ -6515,6 +6518,7 @@
             <w:r>
               <w:rPr>
                 <w:rFonts w:asciiTheme="minorHAnsi" w:hAnsiTheme="minorHAnsi" w:eastAsiaTheme="minorEastAsia" w:cstheme="minorBidi"/>
+                <w:b/>
                 <w:color w:val="000000" w:themeColor="text1"/>
               </w:rPr>
               <w:t>mi</w:t>
@@ -6522,6 +6526,7 @@
             <w:r>
               <w:rPr>
                 <w:rFonts w:asciiTheme="minorHAnsi" w:hAnsiTheme="minorHAnsi" w:eastAsiaTheme="minorEastAsia" w:cstheme="minorBidi"/>
+                <w:b/>
                 <w:color w:val="000000" w:themeColor="text1"/>
               </w:rPr>
               <w:t xml:space="preserve"> proyecto y el perfil de egreso de </w:t>
@@ -6529,6 +6534,7 @@
             <w:r>
               <w:rPr>
                 <w:rFonts w:asciiTheme="minorHAnsi" w:hAnsiTheme="minorHAnsi" w:eastAsiaTheme="minorEastAsia" w:cstheme="minorBidi"/>
+                <w:b/>
                 <w:color w:val="000000" w:themeColor="text1"/>
               </w:rPr>
               <w:t>mi</w:t>
@@ -6536,6 +6542,7 @@
             <w:r>
               <w:rPr>
                 <w:rFonts w:asciiTheme="minorHAnsi" w:hAnsiTheme="minorHAnsi" w:eastAsiaTheme="minorEastAsia" w:cstheme="minorBidi"/>
+                <w:b/>
                 <w:color w:val="000000" w:themeColor="text1"/>
               </w:rPr>
               <w:t xml:space="preserve"> plan de estudio, especificando cómo deb</w:t>
@@ -6543,6 +6550,7 @@
             <w:r>
               <w:rPr>
                 <w:rFonts w:asciiTheme="minorHAnsi" w:hAnsiTheme="minorHAnsi" w:eastAsiaTheme="minorEastAsia" w:cstheme="minorBidi"/>
+                <w:b/>
                 <w:color w:val="000000" w:themeColor="text1"/>
               </w:rPr>
               <w:t>o</w:t>
@@ -6550,6 +6558,7 @@
             <w:r>
               <w:rPr>
                 <w:rFonts w:asciiTheme="minorHAnsi" w:hAnsiTheme="minorHAnsi" w:eastAsiaTheme="minorEastAsia" w:cstheme="minorBidi"/>
+                <w:b/>
                 <w:color w:val="000000" w:themeColor="text1"/>
               </w:rPr>
               <w:t xml:space="preserve"> utilizar distintas competencias para desarrollar </w:t>
@@ -6557,6 +6566,7 @@
             <w:r>
               <w:rPr>
                 <w:rFonts w:asciiTheme="minorHAnsi" w:hAnsiTheme="minorHAnsi" w:eastAsiaTheme="minorEastAsia" w:cstheme="minorBidi"/>
+                <w:b/>
                 <w:color w:val="000000" w:themeColor="text1"/>
               </w:rPr>
               <w:t>mi</w:t>
@@ -6564,6 +6574,7 @@
             <w:r>
               <w:rPr>
                 <w:rFonts w:asciiTheme="minorHAnsi" w:hAnsiTheme="minorHAnsi" w:eastAsiaTheme="minorEastAsia" w:cstheme="minorBidi"/>
+                <w:b/>
                 <w:color w:val="000000" w:themeColor="text1"/>
               </w:rPr>
               <w:t xml:space="preserve"> Proyecto APT. </w:t>
@@ -6574,7 +6585,6 @@
           <w:tcPr>
             <w:tcW w:w="2126" w:type="dxa"/>
             <w:tcMar/>
-            <w:shd w:val="clear" w:color="auto" w:fill="C6E0B4"/>
           </w:tcPr>
           <w:p>
             <w:pPr>
@@ -6588,7 +6598,6 @@
             <w:r>
               <w:rPr>
                 <w:rFonts w:asciiTheme="minorHAnsi" w:hAnsiTheme="minorHAnsi" w:eastAsiaTheme="minorEastAsia" w:cstheme="minorBidi"/>
-                <w:b/>
                 <w:color w:val="000000" w:themeColor="text1"/>
               </w:rPr>
               <w:t xml:space="preserve">Describí </w:t>
@@ -6596,7 +6605,6 @@
             <w:r>
               <w:rPr>
                 <w:rFonts w:asciiTheme="minorHAnsi" w:hAnsiTheme="minorHAnsi" w:eastAsiaTheme="minorEastAsia" w:cstheme="minorBidi"/>
-                <w:b/>
                 <w:color w:val="000000" w:themeColor="text1"/>
               </w:rPr>
               <w:t xml:space="preserve">una relación coherente entre </w:t>
@@ -6604,7 +6612,6 @@
             <w:r>
               <w:rPr>
                 <w:rFonts w:asciiTheme="minorHAnsi" w:hAnsiTheme="minorHAnsi" w:eastAsiaTheme="minorEastAsia" w:cstheme="minorBidi"/>
-                <w:b/>
                 <w:color w:val="000000" w:themeColor="text1"/>
               </w:rPr>
               <w:t>mi</w:t>
@@ -6612,7 +6619,6 @@
             <w:r>
               <w:rPr>
                 <w:rFonts w:asciiTheme="minorHAnsi" w:hAnsiTheme="minorHAnsi" w:eastAsiaTheme="minorEastAsia" w:cstheme="minorBidi"/>
-                <w:b/>
                 <w:color w:val="000000" w:themeColor="text1"/>
               </w:rPr>
               <w:t xml:space="preserve"> proyecto y el perfil de egreso de </w:t>
@@ -6620,7 +6626,6 @@
             <w:r>
               <w:rPr>
                 <w:rFonts w:asciiTheme="minorHAnsi" w:hAnsiTheme="minorHAnsi" w:eastAsiaTheme="minorEastAsia" w:cstheme="minorBidi"/>
-                <w:b/>
                 <w:color w:val="000000" w:themeColor="text1"/>
               </w:rPr>
               <w:t>mi</w:t>
@@ -6628,7 +6633,6 @@
             <w:r>
               <w:rPr>
                 <w:rFonts w:asciiTheme="minorHAnsi" w:hAnsiTheme="minorHAnsi" w:eastAsiaTheme="minorEastAsia" w:cstheme="minorBidi"/>
-                <w:b/>
                 <w:color w:val="000000" w:themeColor="text1"/>
               </w:rPr>
               <w:t xml:space="preserve"> plan de estudio, pero no especifi</w:t>
@@ -6636,7 +6640,6 @@
             <w:r>
               <w:rPr>
                 <w:rFonts w:asciiTheme="minorHAnsi" w:hAnsiTheme="minorHAnsi" w:eastAsiaTheme="minorEastAsia" w:cstheme="minorBidi"/>
-                <w:b/>
                 <w:color w:val="000000" w:themeColor="text1"/>
               </w:rPr>
               <w:t>que</w:t>
@@ -6644,7 +6647,6 @@
             <w:r>
               <w:rPr>
                 <w:rFonts w:asciiTheme="minorHAnsi" w:hAnsiTheme="minorHAnsi" w:eastAsiaTheme="minorEastAsia" w:cstheme="minorBidi"/>
-                <w:b/>
                 <w:color w:val="000000" w:themeColor="text1"/>
               </w:rPr>
               <w:t xml:space="preserve"> cómo deb</w:t>
@@ -6652,7 +6654,6 @@
             <w:r>
               <w:rPr>
                 <w:rFonts w:asciiTheme="minorHAnsi" w:hAnsiTheme="minorHAnsi" w:eastAsiaTheme="minorEastAsia" w:cstheme="minorBidi"/>
-                <w:b/>
                 <w:color w:val="000000" w:themeColor="text1"/>
               </w:rPr>
               <w:t>o</w:t>
@@ -6660,7 +6661,6 @@
             <w:r>
               <w:rPr>
                 <w:rFonts w:asciiTheme="minorHAnsi" w:hAnsiTheme="minorHAnsi" w:eastAsiaTheme="minorEastAsia" w:cstheme="minorBidi"/>
-                <w:b/>
                 <w:color w:val="000000" w:themeColor="text1"/>
               </w:rPr>
               <w:t xml:space="preserve"> utilizar distintas competencias para desarrollar </w:t>
@@ -6668,7 +6668,6 @@
             <w:r>
               <w:rPr>
                 <w:rFonts w:asciiTheme="minorHAnsi" w:hAnsiTheme="minorHAnsi" w:eastAsiaTheme="minorEastAsia" w:cstheme="minorBidi"/>
-                <w:b/>
                 <w:color w:val="000000" w:themeColor="text1"/>
               </w:rPr>
               <w:t>mi</w:t>
@@ -6676,7 +6675,6 @@
             <w:r>
               <w:rPr>
                 <w:rFonts w:asciiTheme="minorHAnsi" w:hAnsiTheme="minorHAnsi" w:eastAsiaTheme="minorEastAsia" w:cstheme="minorBidi"/>
-                <w:b/>
                 <w:color w:val="000000" w:themeColor="text1"/>
               </w:rPr>
               <w:t xml:space="preserve"> Proyecto APT.</w:t>
@@ -6944,6 +6942,7 @@
           <w:tcPr>
             <w:tcW w:w="2268" w:type="dxa"/>
             <w:tcMar/>
+            <w:shd w:val="clear" w:color="auto" w:fill="C6E0B4"/>
           </w:tcPr>
           <w:p>
             <w:pPr>
@@ -6957,6 +6956,7 @@
             <w:r>
               <w:rPr>
                 <w:rFonts w:asciiTheme="minorHAnsi" w:hAnsiTheme="minorHAnsi" w:eastAsiaTheme="minorEastAsia" w:cstheme="minorBidi"/>
+                <w:b/>
                 <w:color w:val="000000" w:themeColor="text1"/>
               </w:rPr>
               <w:t>Mencion</w:t>
@@ -6964,6 +6964,7 @@
             <w:r>
               <w:rPr>
                 <w:rFonts w:asciiTheme="minorHAnsi" w:hAnsiTheme="minorHAnsi" w:eastAsiaTheme="minorEastAsia" w:cstheme="minorBidi"/>
+                <w:b/>
                 <w:color w:val="000000" w:themeColor="text1"/>
               </w:rPr>
               <w:t>é mis</w:t>
@@ -6971,6 +6972,7 @@
             <w:r>
               <w:rPr>
                 <w:rFonts w:asciiTheme="minorHAnsi" w:hAnsiTheme="minorHAnsi" w:eastAsiaTheme="minorEastAsia" w:cstheme="minorBidi"/>
+                <w:b/>
                 <w:color w:val="000000" w:themeColor="text1"/>
               </w:rPr>
               <w:t xml:space="preserve"> intereses profesionales y expli</w:t>
@@ -6978,6 +6980,7 @@
             <w:r>
               <w:rPr>
                 <w:rFonts w:asciiTheme="minorHAnsi" w:hAnsiTheme="minorHAnsi" w:eastAsiaTheme="minorEastAsia" w:cstheme="minorBidi"/>
+                <w:b/>
                 <w:color w:val="000000" w:themeColor="text1"/>
               </w:rPr>
               <w:t>qué</w:t>
@@ -6985,6 +6988,7 @@
             <w:r>
               <w:rPr>
                 <w:rFonts w:asciiTheme="minorHAnsi" w:hAnsiTheme="minorHAnsi" w:eastAsiaTheme="minorEastAsia" w:cstheme="minorBidi"/>
+                <w:b/>
                 <w:color w:val="000000" w:themeColor="text1"/>
               </w:rPr>
               <w:t xml:space="preserve"> con claridad cómo estos se ven reflejados en </w:t>
@@ -6992,6 +6996,7 @@
             <w:r>
               <w:rPr>
                 <w:rFonts w:asciiTheme="minorHAnsi" w:hAnsiTheme="minorHAnsi" w:eastAsiaTheme="minorEastAsia" w:cstheme="minorBidi"/>
+                <w:b/>
                 <w:color w:val="000000" w:themeColor="text1"/>
               </w:rPr>
               <w:t>mi</w:t>
@@ -6999,6 +7004,7 @@
             <w:r>
               <w:rPr>
                 <w:rFonts w:asciiTheme="minorHAnsi" w:hAnsiTheme="minorHAnsi" w:eastAsiaTheme="minorEastAsia" w:cstheme="minorBidi"/>
+                <w:b/>
                 <w:color w:val="000000" w:themeColor="text1"/>
               </w:rPr>
               <w:t xml:space="preserve"> proyecto. </w:t>
@@ -7009,7 +7015,6 @@
           <w:tcPr>
             <w:tcW w:w="2126" w:type="dxa"/>
             <w:tcMar/>
-            <w:shd w:val="clear" w:color="auto" w:fill="C6E0B4"/>
           </w:tcPr>
           <w:p>
             <w:pPr>
@@ -7023,7 +7028,6 @@
             <w:r>
               <w:rPr>
                 <w:rFonts w:asciiTheme="minorHAnsi" w:hAnsiTheme="minorHAnsi" w:eastAsiaTheme="minorEastAsia" w:cstheme="minorBidi"/>
-                <w:b/>
                 <w:color w:val="000000" w:themeColor="text1"/>
               </w:rPr>
               <w:t xml:space="preserve">Mencioné </w:t>
@@ -7031,7 +7035,6 @@
             <w:r>
               <w:rPr>
                 <w:rFonts w:asciiTheme="minorHAnsi" w:hAnsiTheme="minorHAnsi" w:eastAsiaTheme="minorEastAsia" w:cstheme="minorBidi"/>
-                <w:b/>
                 <w:color w:val="000000" w:themeColor="text1"/>
               </w:rPr>
               <w:t>mis</w:t>
@@ -7039,7 +7042,6 @@
             <w:r>
               <w:rPr>
                 <w:rFonts w:asciiTheme="minorHAnsi" w:hAnsiTheme="minorHAnsi" w:eastAsiaTheme="minorEastAsia" w:cstheme="minorBidi"/>
-                <w:b/>
                 <w:color w:val="000000" w:themeColor="text1"/>
               </w:rPr>
               <w:t xml:space="preserve"> intereses profesionales, pero no queda completamente cla</w:t>
@@ -7047,7 +7049,6 @@
             <w:r>
               <w:rPr>
                 <w:rFonts w:asciiTheme="minorHAnsi" w:hAnsiTheme="minorHAnsi" w:eastAsiaTheme="minorEastAsia" w:cstheme="minorBidi"/>
-                <w:b/>
                 <w:color w:val="000000" w:themeColor="text1"/>
               </w:rPr>
               <w:t xml:space="preserve">ra su conexión con </w:t>
@@ -7055,7 +7056,6 @@
             <w:r>
               <w:rPr>
                 <w:rFonts w:asciiTheme="minorHAnsi" w:hAnsiTheme="minorHAnsi" w:eastAsiaTheme="minorEastAsia" w:cstheme="minorBidi"/>
-                <w:b/>
                 <w:color w:val="000000" w:themeColor="text1"/>
               </w:rPr>
               <w:t>mi</w:t>
@@ -7063,7 +7063,6 @@
             <w:r>
               <w:rPr>
                 <w:rFonts w:asciiTheme="minorHAnsi" w:hAnsiTheme="minorHAnsi" w:eastAsiaTheme="minorEastAsia" w:cstheme="minorBidi"/>
-                <w:b/>
                 <w:color w:val="000000" w:themeColor="text1"/>
               </w:rPr>
               <w:t xml:space="preserve"> proyecto.</w:t>
@@ -8239,6 +8238,7 @@
           <w:tcPr>
             <w:tcW w:w="2268" w:type="dxa"/>
             <w:tcMar/>
+            <w:shd w:val="clear" w:color="auto" w:fill="C6E0B4"/>
           </w:tcPr>
           <w:p>
             <w:pPr>
@@ -8252,6 +8252,7 @@
             <w:r>
               <w:rPr>
                 <w:rFonts w:asciiTheme="minorHAnsi" w:hAnsiTheme="minorHAnsi" w:eastAsiaTheme="minorEastAsia" w:cstheme="minorBidi"/>
+                <w:b/>
                 <w:color w:val="000000" w:themeColor="text1"/>
               </w:rPr>
               <w:t>Describ</w:t>
@@ -8259,6 +8260,7 @@
             <w:r>
               <w:rPr>
                 <w:rFonts w:asciiTheme="minorHAnsi" w:hAnsiTheme="minorHAnsi" w:eastAsiaTheme="minorEastAsia" w:cstheme="minorBidi"/>
+                <w:b/>
                 <w:color w:val="000000" w:themeColor="text1"/>
               </w:rPr>
               <w:t>í</w:t>
@@ -8266,6 +8268,7 @@
             <w:r>
               <w:rPr>
                 <w:rFonts w:asciiTheme="minorHAnsi" w:hAnsiTheme="minorHAnsi" w:eastAsiaTheme="minorEastAsia" w:cstheme="minorBidi"/>
+                <w:b/>
                 <w:color w:val="000000" w:themeColor="text1"/>
               </w:rPr>
               <w:t xml:space="preserve"> evidencias que permiten dar cuenta del logro de las actividades de</w:t>
@@ -8273,6 +8276,7 @@
             <w:r>
               <w:rPr>
                 <w:rFonts w:asciiTheme="minorHAnsi" w:hAnsiTheme="minorHAnsi" w:eastAsiaTheme="minorEastAsia" w:cstheme="minorBidi"/>
+                <w:b/>
                 <w:color w:val="000000" w:themeColor="text1"/>
               </w:rPr>
               <w:t xml:space="preserve"> mi</w:t>
@@ -8280,6 +8284,7 @@
             <w:r>
               <w:rPr>
                 <w:rFonts w:asciiTheme="minorHAnsi" w:hAnsiTheme="minorHAnsi" w:eastAsiaTheme="minorEastAsia" w:cstheme="minorBidi"/>
+                <w:b/>
                 <w:color w:val="000000" w:themeColor="text1"/>
               </w:rPr>
               <w:t xml:space="preserve"> proyecto APT y justifi</w:t>
@@ -8287,6 +8292,7 @@
             <w:r>
               <w:rPr>
                 <w:rFonts w:asciiTheme="minorHAnsi" w:hAnsiTheme="minorHAnsi" w:eastAsiaTheme="minorEastAsia" w:cstheme="minorBidi"/>
+                <w:b/>
                 <w:color w:val="000000" w:themeColor="text1"/>
               </w:rPr>
               <w:t>qué</w:t>
@@ -8294,6 +8300,7 @@
             <w:r>
               <w:rPr>
                 <w:rFonts w:asciiTheme="minorHAnsi" w:hAnsiTheme="minorHAnsi" w:eastAsiaTheme="minorEastAsia" w:cstheme="minorBidi"/>
+                <w:b/>
                 <w:color w:val="000000" w:themeColor="text1"/>
               </w:rPr>
               <w:t xml:space="preserve"> su selección. </w:t>
@@ -8426,7 +8433,6 @@
           <w:tcPr>
             <w:tcW w:w="2052" w:type="dxa"/>
             <w:tcMar/>
-            <w:shd w:val="clear" w:color="auto" w:fill="C6E0B4"/>
           </w:tcPr>
           <w:p>
             <w:pPr>
@@ -8440,7 +8446,6 @@
             <w:r>
               <w:rPr>
                 <w:rFonts w:asciiTheme="minorHAnsi" w:hAnsiTheme="minorHAnsi" w:eastAsiaTheme="minorEastAsia" w:cstheme="minorBidi"/>
-                <w:b/>
                 <w:color w:val="000000" w:themeColor="text1"/>
               </w:rPr>
               <w:t>No inclu</w:t>
@@ -8448,7 +8453,6 @@
             <w:r>
               <w:rPr>
                 <w:rFonts w:asciiTheme="minorHAnsi" w:hAnsiTheme="minorHAnsi" w:eastAsiaTheme="minorEastAsia" w:cstheme="minorBidi"/>
-                <w:b/>
                 <w:color w:val="000000" w:themeColor="text1"/>
               </w:rPr>
               <w:t>í</w:t>
@@ -8456,7 +8460,6 @@
             <w:r>
               <w:rPr>
                 <w:rFonts w:asciiTheme="minorHAnsi" w:hAnsiTheme="minorHAnsi" w:eastAsiaTheme="minorEastAsia" w:cstheme="minorBidi"/>
-                <w:b/>
                 <w:color w:val="000000" w:themeColor="text1"/>
               </w:rPr>
               <w:t xml:space="preserve"> evidencias que pueden dar cuenta del desarrollo de </w:t>
@@ -8464,7 +8467,6 @@
             <w:r>
               <w:rPr>
                 <w:rFonts w:asciiTheme="minorHAnsi" w:hAnsiTheme="minorHAnsi" w:eastAsiaTheme="minorEastAsia" w:cstheme="minorBidi"/>
-                <w:b/>
                 <w:color w:val="000000" w:themeColor="text1"/>
               </w:rPr>
               <w:t>mi</w:t>
@@ -8472,7 +8474,6 @@
             <w:r>
               <w:rPr>
                 <w:rFonts w:asciiTheme="minorHAnsi" w:hAnsiTheme="minorHAnsi" w:eastAsiaTheme="minorEastAsia" w:cstheme="minorBidi"/>
-                <w:b/>
                 <w:color w:val="000000" w:themeColor="text1"/>
               </w:rPr>
               <w:t xml:space="preserve"> proyecto.</w:t>
@@ -8542,6 +8543,7 @@
           <w:tcPr>
             <w:tcW w:w="2268" w:type="dxa"/>
             <w:tcMar/>
+            <w:shd w:val="clear" w:color="auto" w:fill="C6E0B4"/>
           </w:tcPr>
           <w:p>
             <w:pPr>
@@ -8555,26 +8557,35 @@
             <w:r>
               <w:rPr>
                 <w:rFonts w:asciiTheme="minorHAnsi" w:hAnsiTheme="minorHAnsi" w:eastAsiaTheme="minorEastAsia" w:cstheme="minorBidi"/>
+                <w:b/>
                 <w:color w:val="000000" w:themeColor="text1"/>
               </w:rPr>
               <w:t>El texto cumple con las reglas ortografía y de redacción en todos sus apartados.</w:t>
             </w:r>
             <w:r>
+              <w:rPr>
+                <w:b/>
+              </w:rPr>
               <w:br/>
             </w:r>
             <w:r>
               <w:rPr>
                 <w:rFonts w:asciiTheme="minorHAnsi" w:hAnsiTheme="minorHAnsi" w:eastAsiaTheme="minorEastAsia" w:cstheme="minorBidi"/>
+                <w:b/>
                 <w:color w:val="000000" w:themeColor="text1"/>
               </w:rPr>
               <w:t>Y</w:t>
             </w:r>
             <w:r>
+              <w:rPr>
+                <w:b/>
+              </w:rPr>
               <w:br/>
             </w:r>
             <w:r>
               <w:rPr>
                 <w:rFonts w:asciiTheme="minorHAnsi" w:hAnsiTheme="minorHAnsi" w:eastAsiaTheme="minorEastAsia" w:cstheme="minorBidi"/>
+                <w:b/>
                 <w:color w:val="000000" w:themeColor="text1"/>
               </w:rPr>
               <w:t>Utili</w:t>
@@ -8582,6 +8593,7 @@
             <w:r>
               <w:rPr>
                 <w:rFonts w:asciiTheme="minorHAnsi" w:hAnsiTheme="minorHAnsi" w:eastAsiaTheme="minorEastAsia" w:cstheme="minorBidi"/>
+                <w:b/>
                 <w:color w:val="000000" w:themeColor="text1"/>
               </w:rPr>
               <w:t>cé</w:t>
@@ -8589,6 +8601,7 @@
             <w:r>
               <w:rPr>
                 <w:rFonts w:asciiTheme="minorHAnsi" w:hAnsiTheme="minorHAnsi" w:eastAsiaTheme="minorEastAsia" w:cstheme="minorBidi"/>
+                <w:b/>
                 <w:color w:val="000000" w:themeColor="text1"/>
               </w:rPr>
               <w:t xml:space="preserve"> correctamente todas las normas de citación y referencias.</w:t>
@@ -8622,7 +8635,6 @@
           <w:tcPr>
             <w:tcW w:w="2127" w:type="dxa"/>
             <w:tcMar/>
-            <w:shd w:val="clear" w:color="auto" w:fill="C6E0B4"/>
           </w:tcPr>
           <w:p>
             <w:pPr>
@@ -8636,7 +8648,6 @@
             <w:r>
               <w:rPr>
                 <w:rFonts w:asciiTheme="minorHAnsi" w:hAnsiTheme="minorHAnsi" w:eastAsiaTheme="minorEastAsia" w:cstheme="minorBidi"/>
-                <w:b/>
                 <w:color w:val="000000" w:themeColor="text1"/>
               </w:rPr>
               <w:t>El texto presenta de 6 a 10 errores de ortografía, redacción o en las citas y referencias del informe.</w:t>
@@ -8729,6 +8740,7 @@
           <w:tcPr>
             <w:tcW w:w="2268" w:type="dxa"/>
             <w:tcMar/>
+            <w:shd w:val="clear" w:color="auto" w:fill="C6E0B4"/>
           </w:tcPr>
           <w:p>
             <w:pPr>
@@ -8742,6 +8754,7 @@
             <w:r>
               <w:rPr>
                 <w:rFonts w:asciiTheme="minorHAnsi" w:hAnsiTheme="minorHAnsi" w:eastAsiaTheme="minorEastAsia" w:cstheme="minorBidi"/>
+                <w:b/>
                 <w:color w:val="000000" w:themeColor="text1"/>
               </w:rPr>
               <w:t>El informe cumple con todos los aspectos del formato establecido por la disciplina.</w:t>
@@ -8775,7 +8788,6 @@
           <w:tcPr>
             <w:tcW w:w="2127" w:type="dxa"/>
             <w:tcMar/>
-            <w:shd w:val="clear" w:color="auto" w:fill="C6E0B4"/>
           </w:tcPr>
           <w:p>
             <w:pPr>
@@ -8789,7 +8801,6 @@
             <w:r>
               <w:rPr>
                 <w:rFonts w:asciiTheme="minorHAnsi" w:hAnsiTheme="minorHAnsi" w:eastAsiaTheme="minorEastAsia" w:cstheme="minorBidi"/>
-                <w:b/>
                 <w:color w:val="000000" w:themeColor="text1"/>
               </w:rPr>
               <w:t>El informe cumple con la mitad de los aspectos del formato establecido por la disciplina</w:t>
@@ -8906,6 +8917,7 @@
           <w:tcPr>
             <w:tcW w:w="2268" w:type="dxa"/>
             <w:tcMar/>
+            <w:shd w:val="clear" w:color="auto" w:fill="C6E0B4"/>
           </w:tcPr>
           <w:p>
             <w:pPr>
@@ -8919,6 +8931,7 @@
             <w:r>
               <w:rPr>
                 <w:rFonts w:asciiTheme="minorHAnsi" w:hAnsiTheme="minorHAnsi" w:eastAsiaTheme="minorEastAsia" w:cstheme="minorBidi"/>
+                <w:b/>
                 <w:color w:val="000000" w:themeColor="text1"/>
                 <w:lang w:eastAsia="es-CL"/>
               </w:rPr>
@@ -8930,7 +8943,6 @@
           <w:tcPr>
             <w:tcW w:w="2126" w:type="dxa"/>
             <w:tcMar/>
-            <w:shd w:val="clear" w:color="auto" w:fill="C6E0B4"/>
           </w:tcPr>
           <w:p>
             <w:pPr>
@@ -8944,7 +8956,6 @@
             <w:r>
               <w:rPr>
                 <w:rFonts w:asciiTheme="minorHAnsi" w:hAnsiTheme="minorHAnsi" w:eastAsiaTheme="minorEastAsia" w:cstheme="minorBidi"/>
-                <w:b/>
                 <w:color w:val="000000" w:themeColor="text1"/>
                 <w:lang w:eastAsia="es-CL"/>
               </w:rPr>
@@ -9159,6 +9170,47 @@
           <w:tcPr>
             <w:tcW w:w="2268" w:type="dxa"/>
             <w:tcMar/>
+            <w:shd w:val="clear" w:color="auto" w:fill="C6E0B4"/>
+          </w:tcPr>
+          <w:p>
+            <w:pPr>
+              <w:spacing w:after="0" w:line="240" w:lineRule="auto"/>
+              <w:jc w:val="both"/>
+              <w:rPr>
+                <w:rFonts w:ascii="Calibri" w:hAnsi="Calibri" w:eastAsia="Calibri" w:cs="Calibri"/>
+                <w:b w:val="0"/>
+                <w:bCs w:val="0"/>
+                <w:i w:val="0"/>
+                <w:iCs w:val="0"/>
+                <w:caps w:val="0"/>
+                <w:smallCaps w:val="0"/>
+                <w:color w:val="000000" w:themeColor="text1" w:themeTint="FF" w:themeShade="FF"/>
+                <w:sz w:val="20"/>
+                <w:szCs w:val="20"/>
+              </w:rPr>
+            </w:pPr>
+            <w:r>
+              <w:rPr>
+                <w:rFonts w:ascii="Calibri" w:hAnsi="Calibri" w:eastAsia="Calibri" w:cs="Calibri"/>
+                <w:b/>
+                <w:bCs w:val="0"/>
+                <w:i w:val="0"/>
+                <w:iCs w:val="0"/>
+                <w:caps w:val="0"/>
+                <w:smallCaps w:val="0"/>
+                <w:color w:val="000000" w:themeColor="text1" w:themeTint="FF" w:themeShade="FF"/>
+                <w:sz w:val="20"/>
+                <w:szCs w:val="20"/>
+                <w:lang w:val="es-ES"/>
+              </w:rPr>
+              <w:t>Redacta los apartados solicitados en inglés, comunicando en un 100% en un nivel intermedio alto según lo solicitado.</w:t>
+            </w:r>
+          </w:p>
+        </w:tc>
+        <w:tc>
+          <w:tcPr>
+            <w:tcW w:w="2126" w:type="dxa"/>
+            <w:tcMar/>
           </w:tcPr>
           <w:p>
             <w:pPr>
@@ -9191,33 +9243,13 @@
                 <w:szCs w:val="20"/>
                 <w:lang w:val="es-ES"/>
               </w:rPr>
-              <w:t>Redacta los apartados solicitados en inglés, comunicando en un 100% en un nivel intermedio alto según lo solicitado.</w:t>
-            </w:r>
-          </w:p>
-        </w:tc>
-        <w:tc>
-          <w:tcPr>
-            <w:tcW w:w="2126" w:type="dxa"/>
-            <w:tcMar/>
-          </w:tcPr>
+              <w:t>Redacta los apartados solicitados en inglés, comunicando en un 60% en un nivel intermedio alto según lo solicitado.</w:t>
+            </w:r>
+          </w:p>
           <w:p>
             <w:pPr>
               <w:spacing w:after="0" w:line="240" w:lineRule="auto"/>
               <w:jc w:val="both"/>
-              <w:rPr>
-                <w:rFonts w:ascii="Calibri" w:hAnsi="Calibri" w:eastAsia="Calibri" w:cs="Calibri"/>
-                <w:b w:val="0"/>
-                <w:bCs w:val="0"/>
-                <w:i w:val="0"/>
-                <w:iCs w:val="0"/>
-                <w:caps w:val="0"/>
-                <w:smallCaps w:val="0"/>
-                <w:color w:val="000000" w:themeColor="text1" w:themeTint="FF" w:themeShade="FF"/>
-                <w:sz w:val="20"/>
-                <w:szCs w:val="20"/>
-              </w:rPr>
-            </w:pPr>
-            <w:r>
               <w:rPr>
                 <w:rFonts w:ascii="Calibri" w:hAnsi="Calibri" w:eastAsia="Calibri" w:cs="Calibri"/>
                 <w:b w:val="0"/>
@@ -9231,13 +9263,32 @@
                 <w:szCs w:val="20"/>
                 <w:lang w:val="es-ES"/>
               </w:rPr>
-              <w:t>Redacta los apartados solicitados en inglés, comunicando en un 60% en un nivel intermedio alto según lo solicitado.</w:t>
-            </w:r>
-          </w:p>
+            </w:pPr>
+          </w:p>
+        </w:tc>
+        <w:tc>
+          <w:tcPr>
+            <w:tcW w:w="2127" w:type="dxa"/>
+            <w:tcMar/>
+          </w:tcPr>
           <w:p>
             <w:pPr>
               <w:spacing w:after="0" w:line="240" w:lineRule="auto"/>
               <w:jc w:val="both"/>
+              <w:rPr>
+                <w:rFonts w:ascii="Calibri" w:hAnsi="Calibri" w:eastAsia="Calibri" w:cs="Calibri"/>
+                <w:b w:val="0"/>
+                <w:bCs w:val="0"/>
+                <w:i w:val="0"/>
+                <w:iCs w:val="0"/>
+                <w:caps w:val="0"/>
+                <w:smallCaps w:val="0"/>
+                <w:color w:val="000000" w:themeColor="text1" w:themeTint="FF" w:themeShade="FF"/>
+                <w:sz w:val="20"/>
+                <w:szCs w:val="20"/>
+              </w:rPr>
+            </w:pPr>
+            <w:r>
               <w:rPr>
                 <w:rFonts w:ascii="Calibri" w:hAnsi="Calibri" w:eastAsia="Calibri" w:cs="Calibri"/>
                 <w:b w:val="0"/>
@@ -9251,32 +9302,13 @@
                 <w:szCs w:val="20"/>
                 <w:lang w:val="es-ES"/>
               </w:rPr>
-            </w:pPr>
-          </w:p>
-        </w:tc>
-        <w:tc>
-          <w:tcPr>
-            <w:tcW w:w="2127" w:type="dxa"/>
-            <w:tcMar/>
-          </w:tcPr>
+              <w:t>Redacta los apartados solicitados en inglés, comunicando en un 30% en un nivel intermedio alto lo solicitado.</w:t>
+            </w:r>
+          </w:p>
           <w:p>
             <w:pPr>
               <w:spacing w:after="0" w:line="240" w:lineRule="auto"/>
               <w:jc w:val="both"/>
-              <w:rPr>
-                <w:rFonts w:ascii="Calibri" w:hAnsi="Calibri" w:eastAsia="Calibri" w:cs="Calibri"/>
-                <w:b w:val="0"/>
-                <w:bCs w:val="0"/>
-                <w:i w:val="0"/>
-                <w:iCs w:val="0"/>
-                <w:caps w:val="0"/>
-                <w:smallCaps w:val="0"/>
-                <w:color w:val="000000" w:themeColor="text1" w:themeTint="FF" w:themeShade="FF"/>
-                <w:sz w:val="20"/>
-                <w:szCs w:val="20"/>
-              </w:rPr>
-            </w:pPr>
-            <w:r>
               <w:rPr>
                 <w:rFonts w:ascii="Calibri" w:hAnsi="Calibri" w:eastAsia="Calibri" w:cs="Calibri"/>
                 <w:b w:val="0"/>
@@ -9290,9 +9322,14 @@
                 <w:szCs w:val="20"/>
                 <w:lang w:val="es-ES"/>
               </w:rPr>
-              <w:t>Redacta los apartados solicitados en inglés, comunicando en un 30% en un nivel intermedio alto lo solicitado.</w:t>
-            </w:r>
-          </w:p>
+            </w:pPr>
+          </w:p>
+        </w:tc>
+        <w:tc>
+          <w:tcPr>
+            <w:tcW w:w="2052" w:type="dxa"/>
+            <w:tcMar/>
+          </w:tcPr>
           <w:p>
             <w:pPr>
               <w:spacing w:after="0" w:line="240" w:lineRule="auto"/>
@@ -9308,38 +9345,12 @@
                 <w:color w:val="000000" w:themeColor="text1" w:themeTint="FF" w:themeShade="FF"/>
                 <w:sz w:val="20"/>
                 <w:szCs w:val="20"/>
-                <w:lang w:val="es-ES"/>
-              </w:rPr>
-            </w:pPr>
-          </w:p>
-        </w:tc>
-        <w:tc>
-          <w:tcPr>
-            <w:tcW w:w="2052" w:type="dxa"/>
-            <w:tcMar/>
-            <w:shd w:val="clear" w:color="auto" w:fill="C6E0B4"/>
-          </w:tcPr>
-          <w:p>
-            <w:pPr>
-              <w:spacing w:after="0" w:line="240" w:lineRule="auto"/>
-              <w:jc w:val="both"/>
+              </w:rPr>
+            </w:pPr>
+            <w:r>
               <w:rPr>
                 <w:rFonts w:ascii="Calibri" w:hAnsi="Calibri" w:eastAsia="Calibri" w:cs="Calibri"/>
                 <w:b w:val="0"/>
-                <w:bCs w:val="0"/>
-                <w:i w:val="0"/>
-                <w:iCs w:val="0"/>
-                <w:caps w:val="0"/>
-                <w:smallCaps w:val="0"/>
-                <w:color w:val="000000" w:themeColor="text1" w:themeTint="FF" w:themeShade="FF"/>
-                <w:sz w:val="20"/>
-                <w:szCs w:val="20"/>
-              </w:rPr>
-            </w:pPr>
-            <w:r>
-              <w:rPr>
-                <w:rFonts w:ascii="Calibri" w:hAnsi="Calibri" w:eastAsia="Calibri" w:cs="Calibri"/>
-                <w:b/>
                 <w:bCs w:val="0"/>
                 <w:i w:val="0"/>
                 <w:iCs w:val="0"/>

</xml_diff>